<commit_message>
Clean double spaces in manuscript text (5 paragraphs)
</commit_message>
<xml_diff>
--- a/paper/manuscript_cms_final_v4.docx
+++ b/paper/manuscript_cms_final_v4.docx
@@ -112,59 +112,7 @@
         <w:rPr>
           <w:rFonts w:ascii="Times New Roman" w:hAnsi="Times New Roman" w:eastAsia="Times New Roman"/>
         </w:rPr>
-        <w:t>Machine learning  accelerates the discovery of ABO</w:t>
-      </w:r>
-      <w:r>
-        <w:rPr>
-          <w:rFonts w:hint="eastAsia" w:ascii="Times New Roman" w:hAnsi="Times New Roman" w:eastAsia="Times New Roman"/>
-          <w:vertAlign w:val="subscript"/>
-          <w:lang w:val="en-US" w:eastAsia="zh-CN"/>
-        </w:rPr>
-        <w:t>3</w:t>
-      </w:r>
-      <w:r>
-        <w:rPr>
-          <w:rFonts w:ascii="Times New Roman" w:hAnsi="Times New Roman" w:eastAsia="Times New Roman"/>
-        </w:rPr>
-        <w:t xml:space="preserve"> perovskite oxides, yet most existing models provide only point predictions without  </w:t>
-      </w:r>
-      <w:r>
-        <w:rPr>
-          <w:rFonts w:hint="default" w:ascii="Times New Roman" w:hAnsi="Times New Roman" w:eastAsia="Times New Roman"/>
-        </w:rPr>
-        <w:t>reliability metrics</w:t>
-      </w:r>
-      <w:r>
-        <w:rPr>
-          <w:rFonts w:ascii="Times New Roman" w:hAnsi="Times New Roman" w:eastAsia="Times New Roman"/>
-        </w:rPr>
-        <w:t xml:space="preserve">—an important gap for high-throughput  screening where false positives waste costly first-principles verification. We present an uncertainty-aware prediction framework for perovskite formation energy and thermodynamic stability (energy above the convex hull). The framework couples a physics-informed  point predictor (KernelRidge baseline + gradient-boosted decision tree stacking residual) with Conformalized Quantile Regression (CQR), which provides sample-adaptive prediction intervals with finite-sample coverage guarantees. A multi-method applicability domain (ensemble </w:t>
-      </w:r>
-      <w:r>
-        <w:rPr>
-          <w:rFonts w:hint="default" w:ascii="Times New Roman" w:hAnsi="Times New Roman" w:eastAsia="Times New Roman"/>
-        </w:rPr>
-        <w:t>σ</w:t>
-      </w:r>
-      <w:r>
-        <w:rPr>
-          <w:rFonts w:ascii="Times New Roman" w:hAnsi="Times New Roman" w:eastAsia="Times New Roman"/>
-        </w:rPr>
-        <w:t>, k-NN distance, leverage) delimits the trusted prediction region, and symbolic regression consensus validates known chemistry, with A-site electronegativity appearing in all 50 independent symbolic-regression runs. On 4,914 perovskites, the framework achieves R</w:t>
-      </w:r>
-      <w:r>
-        <w:rPr>
-          <w:rFonts w:hint="eastAsia" w:ascii="Times New Roman" w:hAnsi="Times New Roman" w:eastAsia="Times New Roman"/>
-          <w:vertAlign w:val="superscript"/>
-          <w:lang w:val="en-US" w:eastAsia="zh-CN"/>
-        </w:rPr>
-        <w:t>2</w:t>
-      </w:r>
-      <w:r>
-        <w:rPr>
-          <w:rFonts w:ascii="Times New Roman" w:hAnsi="Times New Roman" w:eastAsia="Times New Roman"/>
-        </w:rPr>
-        <w:t xml:space="preserve"> = 0.914 (formation energy) and 0.800 (energy above hull), with CQR reducing the expected calibration error by 43–60% relative to standard split conformal using an equivalent LightGBM baseline. Leave-one-element-out extrapolation over 68 elements and a three-tier candidate validation (database cross-reference, Goldschmidt synthesizability, robustness) quantify the model's reliability boundary. We discuss the decoupling tension between point and interval predictions, the empirical applicability boundary of symbolic regression (formation energy succeeds at signal-to-noise ratio, SNR = 2.61; hull energy fails at SNR = 0.94), and the role of the physics baseline as an interpretability anchor rather than an accuracy contributor.</w:t>
+        <w:t>Machine learning accelerates the discovery of ABO3 perovskite oxides, yet most existing models provide only point predictions without  reliability metrics—an important gap for high-throughput screening where false positives waste costly first-principles verification. We present an uncertainty-aware prediction framework for perovskite formation energy and thermodynamic stability (energy above the convex hull). The framework couples a physics-informed point predictor (KernelRidge baseline + gradient-boosted decision tree stacking residual) with Conformalized Quantile Regression (CQR), which provides sample-adaptive prediction intervals with finite-sample coverage guarantees. A multi-method applicability domain (ensemble σ, k-NN distance, leverage) delimits the trusted prediction region, and symbolic regression consensus validates known chemistry, with A-site electronegativity appearing in all 50 independent symbolic-regression runs. On 4,914 perovskites, the framework achieves R2 = 0.914 (formation energy) and 0.800 (energy above hull), with CQR reducing the expected calibration error by 43–60% relative to standard split conformal using an equivalent LightGBM baseline. Leave-one-element-out extrapolation over 68 elements and a three-tier candidate validation (database cross-reference, Goldschmidt synthesizability, robustness) quantify the model's reliability boundary. We discuss the decoupling tension between point and interval predictions, the empirical applicability boundary of symbolic regression (formation energy succeeds at signal-to-noise ratio, SNR = 2.61; hull energy fails at SNR = 0.94), and the role of the physics baseline as an interpretability anchor rather than an accuracy contributor.</w:t>
       </w:r>
     </w:p>
     <w:p>
@@ -622,9 +570,9 @@
       </w:pPr>
       <w:r>
         <w:rPr>
-          <w:rFonts w:hint="default" w:ascii="Times New Roman" w:hAnsi="Times New Roman" w:eastAsia="Times New Roman"/>
-        </w:rPr>
-        <w:t>Existing perovskite ML models report aggregate accuracy but do not provide calibrated per-sample uncertainty, a trust boundary, or element-level extrapolation maps. By integrating CQR, multi-criteria AD, and LOEO into a single reproducible pipeline, this work moves beyond point-prediction benchmarks toward reliability-aware screening—a shift that is necessary for high-throughput  computational materials discovery but remains uncommon in the perovskite literature.</w:t>
+          <w:rFonts w:ascii="Times New Roman" w:hAnsi="Times New Roman" w:eastAsia="Times New Roman"/>
+        </w:rPr>
+        <w:t>Existing perovskite ML models report aggregate accuracy but do not provide calibrated per-sample uncertainty, a trust boundary, or element-level extrapolation maps. By integrating CQR, multi-criteria AD, and LOEO into a single reproducible pipeline, this work moves beyond point-prediction benchmarks toward reliability-aware screening—a shift that is necessary for high-throughput computational materials discovery but remains uncommon in the perovskite literature.</w:t>
       </w:r>
     </w:p>
     <w:p>
@@ -2874,28 +2822,6 @@
         <w:ind w:firstLine="0"/>
         <w:textAlignment w:val="auto"/>
       </w:pPr>
-      <w:r>
-        <w:rPr>
-          <w:rFonts w:hint="eastAsia" w:eastAsia="宋体"/>
-          <w:i w:val="0"/>
-          <w:lang w:val="en-US" w:eastAsia="zh-CN"/>
-        </w:rPr>
-        <w:t>w</w:t>
-      </w:r>
-      <w:r>
-        <w:rPr>
-          <w:i w:val="0"/>
-        </w:rPr>
-        <w:t>here</w:t>
-      </w:r>
-      <w:r>
-        <w:rPr>
-          <w:rFonts w:hint="eastAsia" w:eastAsia="宋体"/>
-          <w:i w:val="0"/>
-          <w:lang w:val="en-US" w:eastAsia="zh-CN"/>
-        </w:rPr>
-        <w:t xml:space="preserve"> </w:t>
-      </w:r>
       <m:oMath>
         <m:sSub>
           <m:sSubPr>
@@ -2985,32 +2911,6 @@
           </m:sub>
         </m:sSub>
       </m:oMath>
-      <w:r>
-        <w:rPr>
-          <w:i w:val="0"/>
-        </w:rPr>
-        <w:t>(</w:t>
-      </w:r>
-      <w:r>
-        <w:rPr>
-          <w:i/>
-          <w:iCs/>
-        </w:rPr>
-        <w:t>x</w:t>
-      </w:r>
-      <w:r>
-        <w:rPr>
-          <w:i w:val="0"/>
-        </w:rPr>
-        <w:t>) is the residual prediction of the m-th GBDT base learner and the meta-learner weights</w:t>
-      </w:r>
-      <w:r>
-        <w:rPr>
-          <w:i w:val="0"/>
-          <w:iCs w:val="0"/>
-        </w:rPr>
-        <w:t xml:space="preserve"> </w:t>
-      </w:r>
       <m:oMath>
         <m:r>
           <m:rPr>
@@ -3028,13 +2928,6 @@
           <m:t>ѡ</m:t>
         </m:r>
       </m:oMath>
-      <w:r>
-        <w:rPr>
-          <w:i w:val="0"/>
-          <w:iCs w:val="0"/>
-        </w:rPr>
-        <w:t xml:space="preserve"> = (</w:t>
-      </w:r>
       <m:oMath>
         <m:sSub>
           <m:sSubPr>
@@ -3098,13 +2991,6 @@
           </m:sub>
         </m:sSub>
       </m:oMath>
-      <w:r>
-        <w:rPr>
-          <w:i w:val="0"/>
-          <w:iCs w:val="0"/>
-        </w:rPr>
-        <w:t xml:space="preserve">, </w:t>
-      </w:r>
       <m:oMath>
         <m:sSub>
           <m:sSubPr>
@@ -3168,13 +3054,6 @@
           </m:sub>
         </m:sSub>
       </m:oMath>
-      <w:r>
-        <w:rPr>
-          <w:i w:val="0"/>
-          <w:iCs w:val="0"/>
-        </w:rPr>
-        <w:t xml:space="preserve">, </w:t>
-      </w:r>
       <m:oMath>
         <m:sSub>
           <m:sSubPr>
@@ -3238,13 +3117,6 @@
           </m:sub>
         </m:sSub>
       </m:oMath>
-      <w:r>
-        <w:rPr>
-          <w:i w:val="0"/>
-          <w:iCs w:val="0"/>
-        </w:rPr>
-        <w:t xml:space="preserve">, </w:t>
-      </w:r>
       <m:oMath>
         <m:sSub>
           <m:sSubPr>
@@ -3311,15 +3183,8 @@
       <w:r>
         <w:rPr>
           <w:i w:val="0"/>
-          <w:iCs w:val="0"/>
-        </w:rPr>
-        <w:t>)</w:t>
-      </w:r>
-      <w:r>
-        <w:rPr>
-          <w:i w:val="0"/>
-        </w:rPr>
-        <w:t xml:space="preserve"> are fit by Ridge regression on inner 3-fold out-of-fold predictions to avoid leakage (stacked generalization framework). The final point prediction is</w:t>
+        </w:rPr>
+        <w:t>where (x) is the residual prediction of the m-th GBDT base learner and the meta-learner weights = (, , , ) are fit by Ridge regression on inner 3-fold out-of-fold predictions to avoid leakage (stacked generalization framework). The final point prediction is</w:t>
       </w:r>
     </w:p>
     <w:p>
@@ -11766,12 +11631,10 @@
       </w:pPr>
       <w:r>
         <w:rPr>
-          <w:rFonts w:hint="eastAsia" w:ascii="Times New Roman" w:hAnsi="Times New Roman" w:eastAsia="Times New Roman" w:cstheme="minorBidi"/>
+          <w:rFonts w:ascii="Times New Roman" w:hAnsi="Times New Roman" w:eastAsia="Times New Roman"/>
           <w:sz w:val="24"/>
-          <w:szCs w:val="24"/>
-          <w:lang w:val="en-US" w:eastAsia="en-US" w:bidi="ar-SA"/>
-        </w:rPr>
-        <w:t>Table 1.  uses a distinct Materials-Project-derived ABX3 dataset and is included for context only.</w:t>
+        </w:rPr>
+        <w:t>Table 1. uses a distinct Materials-Project-derived ABX3 dataset and is included for context only.</w:t>
       </w:r>
     </w:p>
     <w:p>
@@ -15380,32 +15243,8 @@
         <w:rPr>
           <w:rFonts w:ascii="Times New Roman" w:hAnsi="Times New Roman" w:eastAsia="Times New Roman"/>
           <w:b/>
-          <w:bCs/>
-        </w:rPr>
-        <w:t xml:space="preserve">Fig. </w:t>
-      </w:r>
-      <w:r>
-        <w:rPr>
-          <w:rFonts w:hint="eastAsia" w:eastAsia="宋体"/>
-          <w:b/>
-          <w:bCs/>
-          <w:lang w:val="en-US" w:eastAsia="zh-CN"/>
-        </w:rPr>
-        <w:t>7</w:t>
-      </w:r>
-      <w:r>
-        <w:rPr>
-          <w:rFonts w:ascii="Times New Roman" w:hAnsi="Times New Roman" w:eastAsia="Times New Roman"/>
-          <w:b/>
-          <w:bCs/>
-        </w:rPr>
-        <w:t>.</w:t>
-      </w:r>
-      <w:r>
-        <w:rPr>
-          <w:rFonts w:ascii="Times New Roman" w:hAnsi="Times New Roman" w:eastAsia="Times New Roman"/>
-        </w:rPr>
-        <w:t xml:space="preserve"> Leave-one-element-out  extrapolation R-squared for representative A-site elements.</w:t>
+        </w:rPr>
+        <w:t>Fig. 7. Leave-one-element-out extrapolation R-squared for representative A-site elements.</w:t>
       </w:r>
     </w:p>
     <w:p>

</xml_diff>